<commit_message>
Neutralize contributor-specific labels across repository
</commit_message>
<xml_diff>
--- a/FlowMOP_submission.docx
+++ b/FlowMOP_submission.docx
@@ -81,7 +81,7 @@
     </w:p>
     <w:p>
       <w:r>
-        <w:t xml:space="preserve">Tony Xu [1], Nadia </w:t>
+        <w:t xml:space="preserve">Tony Xu [1], N. </w:t>
       </w:r>
       <w:r>
         <w:t>A</w:t>
@@ -306,7 +306,7 @@
           <w:sz w:val="20"/>
           <w:szCs w:val="20"/>
         </w:rPr>
-        <w:t xml:space="preserve">Tony Xu &lt;Tony.Xu@anu.edu.au&gt;; Nadia </w:t>
+        <w:t xml:space="preserve">Tony Xu &lt;Tony.Xu@anu.edu.au&gt;; N. </w:t>
       </w:r>
       <w:r>
         <w:rPr>
@@ -334,7 +334,7 @@
           <w:sz w:val="20"/>
           <w:szCs w:val="20"/>
         </w:rPr>
-        <w:t xml:space="preserve">Roberts &lt;Nadia.Roberts@anu.edu.au&gt;; Felix Marsh-Wakefield &lt;felix.marsh-wakefield@sydney.edu.au&gt;; Rebecca </w:t>
+        <w:t xml:space="preserve">Roberts &lt;contact unavailable&gt;; Felix Marsh-Wakefield &lt;felix.marsh-wakefield@sydney.edu.au&gt;; Rebecca </w:t>
       </w:r>
       <w:r>
         <w:rPr>

</xml_diff>